<commit_message>
Initial Draft of Non-technical Report
Needs to be shortened to 2-3 pages after all analysis is done.
</commit_message>
<xml_diff>
--- a/Non Technical Report - Project_2_Data_624.docx
+++ b/Non Technical Report - Project_2_Data_624.docx
@@ -2,7 +2,863 @@
 <file path=word/document.xml><?xml version="1.0" encoding="utf-8"?>
 <w:document xmlns:wpc="http://schemas.microsoft.com/office/word/2010/wordprocessingCanvas" xmlns:cx="http://schemas.microsoft.com/office/drawing/2014/chartex" xmlns:cx1="http://schemas.microsoft.com/office/drawing/2015/9/8/chartex" xmlns:cx2="http://schemas.microsoft.com/office/drawing/2015/10/21/chartex" xmlns:cx3="http://schemas.microsoft.com/office/drawing/2016/5/9/chartex" xmlns:cx4="http://schemas.microsoft.com/office/drawing/2016/5/10/chartex" xmlns:cx5="http://schemas.microsoft.com/office/drawing/2016/5/11/chartex" xmlns:cx6="http://schemas.microsoft.com/office/drawing/2016/5/12/chartex" xmlns:cx7="http://schemas.microsoft.com/office/drawing/2016/5/13/chartex" xmlns:cx8="http://schemas.microsoft.com/office/drawing/2016/5/14/chartex" xmlns:mc="http://schemas.openxmlformats.org/markup-compatibility/2006" xmlns:aink="http://schemas.microsoft.com/office/drawing/2016/ink" xmlns:am3d="http://schemas.microsoft.com/office/drawing/2017/model3d" xmlns:o="urn:schemas-microsoft-com:office:office" xmlns:oel="http://schemas.microsoft.com/office/2019/extlst" xmlns:r="http://schemas.openxmlformats.org/officeDocument/2006/relationships" xmlns:m="http://schemas.openxmlformats.org/officeDocument/2006/math" xmlns:v="urn:schemas-microsoft-com:vml" xmlns:wp14="http://schemas.microsoft.com/office/word/2010/wordprocessingDrawing" xmlns:wp="http://schemas.openxmlformats.org/drawingml/2006/wordprocessingDrawing" xmlns:w10="urn:schemas-microsoft-com:office:word" xmlns:w="http://schemas.openxmlformats.org/wordprocessingml/2006/main" xmlns:w14="http://schemas.microsoft.com/office/word/2010/wordml" xmlns:w15="http://schemas.microsoft.com/office/word/2012/wordml" xmlns:w16cex="http://schemas.microsoft.com/office/word/2018/wordml/cex" xmlns:w16cid="http://schemas.microsoft.com/office/word/2016/wordml/cid" xmlns:w16="http://schemas.microsoft.com/office/word/2018/wordml" xmlns:w16du="http://schemas.microsoft.com/office/word/2023/wordml/word16du" xmlns:w16sdtdh="http://schemas.microsoft.com/office/word/2020/wordml/sdtdatahash" xmlns:w16sdtfl="http://schemas.microsoft.com/office/word/2024/wordml/sdtformatlock" xmlns:w16se="http://schemas.microsoft.com/office/word/2015/wordml/symex" xmlns:wpg="http://schemas.microsoft.com/office/word/2010/wordprocessingGroup" xmlns:wpi="http://schemas.microsoft.com/office/word/2010/wordprocessingInk" xmlns:wne="http://schemas.microsoft.com/office/word/2006/wordml" xmlns:wps="http://schemas.microsoft.com/office/word/2010/wordprocessingShape" mc:Ignorable="w14 w15 w16se w16cid w16 w16cex w16sdtdh w16sdtfl w16du wp14">
   <w:body>
+    <w:p>
+      <w:r>
+        <w:t xml:space="preserve">Jackie Yee and </w:t>
+      </w:r>
+      <w:proofErr w:type="spellStart"/>
+      <w:r>
+        <w:t>Mubashira</w:t>
+      </w:r>
+      <w:proofErr w:type="spellEnd"/>
+      <w:r>
+        <w:t xml:space="preserve"> Qari</w:t>
+      </w:r>
+    </w:p>
+    <w:p>
+      <w:r>
+        <w:t>DATA 624</w:t>
+      </w:r>
+    </w:p>
+    <w:p>
+      <w:r>
+        <w:t>Non-Technical Report</w:t>
+      </w:r>
+    </w:p>
     <w:p/>
+    <w:p>
+      <w:r>
+        <w:t xml:space="preserve">As the data science team at ABC Beverage, we are tasked to provide analysis of the company's manufacturing process, the predictive factors and our predictive model of PH to meet compliance </w:t>
+      </w:r>
+      <w:proofErr w:type="gramStart"/>
+      <w:r>
+        <w:t>of</w:t>
+      </w:r>
+      <w:proofErr w:type="gramEnd"/>
+      <w:r>
+        <w:t xml:space="preserve"> the new regulations.</w:t>
+      </w:r>
+    </w:p>
+    <w:p>
+      <w:r>
+        <w:t xml:space="preserve">Through our exploratory data analysis, we can see that </w:t>
+      </w:r>
+      <w:r>
+        <w:t xml:space="preserve">we can see that there is 1 categorical variable </w:t>
+      </w:r>
+      <w:proofErr w:type="spellStart"/>
+      <w:r>
+        <w:t>Brand.Code</w:t>
+      </w:r>
+      <w:proofErr w:type="spellEnd"/>
+      <w:r>
+        <w:t xml:space="preserve">, our target variable PH, and 31 predictor variables. Additionally, we can see that many of these predictor variables and </w:t>
+      </w:r>
+      <w:proofErr w:type="spellStart"/>
+      <w:r>
+        <w:t>Brand.Code</w:t>
+      </w:r>
+      <w:proofErr w:type="spellEnd"/>
+      <w:r>
+        <w:t xml:space="preserve"> contain NAs. Notably, in </w:t>
+      </w:r>
+      <w:proofErr w:type="spellStart"/>
+      <w:r>
+        <w:t>Brand.Code</w:t>
+      </w:r>
+      <w:proofErr w:type="spellEnd"/>
+      <w:r>
+        <w:t xml:space="preserve">, approximately 48% were categorized into </w:t>
+      </w:r>
+      <w:proofErr w:type="gramStart"/>
+      <w:r>
+        <w:t>B making</w:t>
+      </w:r>
+      <w:proofErr w:type="gramEnd"/>
+      <w:r>
+        <w:t xml:space="preserve"> the most frequent brand code.</w:t>
+      </w:r>
+    </w:p>
+    <w:p/>
+    <w:p>
+      <w:r>
+        <w:t xml:space="preserve">We check for any duplicated rows in the train data through the duplicated function. This is to inform us if any duplicated data needs to be </w:t>
+      </w:r>
+      <w:proofErr w:type="gramStart"/>
+      <w:r>
+        <w:t>handled with</w:t>
+      </w:r>
+      <w:proofErr w:type="gramEnd"/>
+      <w:r>
+        <w:t xml:space="preserve"> appropriately. From the output, we can see that there is no duplicated data. So, next we can begin to check for the percentage of missing data in our </w:t>
+      </w:r>
+      <w:proofErr w:type="gramStart"/>
+      <w:r>
+        <w:t>dataset</w:t>
+      </w:r>
+      <w:proofErr w:type="gramEnd"/>
+      <w:r>
+        <w:t>, so that we can begin uncovering any patterns related to the missingness.</w:t>
+      </w:r>
+    </w:p>
+    <w:p>
+      <w:r>
+        <w:t xml:space="preserve">We conduct a quick NHANES check to see which type of data mechanism it could possibly be. To do this, we can check the missing data mechanism through summary statistics. We do so through looking at the overall missingness per variable, which allows us to identify why the data is missing. From the summary statistic, we </w:t>
+      </w:r>
+      <w:proofErr w:type="gramStart"/>
+      <w:r>
+        <w:t>are able to</w:t>
+      </w:r>
+      <w:proofErr w:type="gramEnd"/>
+      <w:r>
+        <w:t xml:space="preserve"> see that the missing data is likely [MAR (Missing </w:t>
+      </w:r>
+      <w:proofErr w:type="gramStart"/>
+      <w:r>
+        <w:t>At</w:t>
+      </w:r>
+      <w:proofErr w:type="gramEnd"/>
+      <w:r>
+        <w:t xml:space="preserve"> Random) or MCAR (Missing Completely </w:t>
+      </w:r>
+      <w:proofErr w:type="gramStart"/>
+      <w:r>
+        <w:t>At</w:t>
+      </w:r>
+      <w:proofErr w:type="gramEnd"/>
+      <w:r>
+        <w:t xml:space="preserve"> Random), but not MNAR (Missing Not </w:t>
+      </w:r>
+      <w:proofErr w:type="gramStart"/>
+      <w:r>
+        <w:t>At</w:t>
+      </w:r>
+      <w:proofErr w:type="gramEnd"/>
+      <w:r>
+        <w:t xml:space="preserve"> Random</w:t>
+      </w:r>
+      <w:proofErr w:type="gramStart"/>
+      <w:r>
+        <w:t>)](</w:t>
+      </w:r>
+      <w:proofErr w:type="gramEnd"/>
+      <w:r>
+        <w:t>https://www.r-bloggers.com/2025/08/handling-missing-data-in-r-a-comprehensive-guide/). This is due to MFR containing the highest number of NAs (8.2%), which tells us that missingness is not uniform across variables and that most other variables have &lt; 2% missingness.</w:t>
+      </w:r>
+    </w:p>
+    <w:p/>
+    <w:p>
+      <w:r>
+        <w:t xml:space="preserve">To validate that the data mechanism is MAR, we can check if MFR </w:t>
+      </w:r>
+      <w:proofErr w:type="gramStart"/>
+      <w:r>
+        <w:t>against</w:t>
+      </w:r>
+      <w:proofErr w:type="gramEnd"/>
+      <w:r>
+        <w:t xml:space="preserve"> the mean temperature. From the summary, we can see that when MFR is not missing, the mean temperature is lower than when the MFR is missing. This tells us that there's around a difference of 1.88 degrees Fahrenheit higher mean Temperature when MFR is missing, so MFR does correlates with higher temperature.</w:t>
+      </w:r>
+    </w:p>
+    <w:p/>
+    <w:p>
+      <w:r>
+        <w:lastRenderedPageBreak/>
+        <w:t>Additionally, to validate, we can run a Welch Two Sample t-test to check if it is a significant difference. By rejecting the Null Hypothesis that the null values are MCAR, we accept the alternative that the data mechanism is MAR. Telling us that the missingness has a pattern.</w:t>
+      </w:r>
+    </w:p>
+    <w:p/>
+    <w:p>
+      <w:r>
+        <w:t>Additionally, to validate, we can run a Welch Two Sample t-test to check if it is a significant difference. By rejecting the Null Hypothesis that the null values are MCAR, we accept the alternative that the data mechanism is MAR. Telling us that the missingness has a pattern.</w:t>
+      </w:r>
+    </w:p>
+    <w:p/>
+    <w:p>
+      <w:r>
+        <w:t xml:space="preserve">The </w:t>
+      </w:r>
+      <w:proofErr w:type="spellStart"/>
+      <w:r>
+        <w:t>vis_miss</w:t>
+      </w:r>
+      <w:proofErr w:type="spellEnd"/>
+      <w:r>
+        <w:t xml:space="preserve"> function from the </w:t>
+      </w:r>
+      <w:proofErr w:type="spellStart"/>
+      <w:r>
+        <w:t>naniar</w:t>
+      </w:r>
+      <w:proofErr w:type="spellEnd"/>
+      <w:r>
+        <w:t xml:space="preserve"> library visualizes any patterns or relationships that may need to be preserved. In the plots below, it confirms our summary statistics as we observed that around 1% of the data contains NAs or missing data. 8% of the missing data being from MFR. Other predictors have missingness &lt; 2.5%.</w:t>
+      </w:r>
+    </w:p>
+    <w:p/>
+    <w:p>
+      <w:r>
+        <w:t xml:space="preserve">From our analysis of the missingness in the dataset, we can conclude that the data mechanism is MAR. Since it is MAR, it is suggested that handle the missing data through multiple </w:t>
+      </w:r>
+      <w:proofErr w:type="gramStart"/>
+      <w:r>
+        <w:t>imputation</w:t>
+      </w:r>
+      <w:proofErr w:type="gramEnd"/>
+      <w:r>
+        <w:t xml:space="preserve"> such as </w:t>
+      </w:r>
+      <w:proofErr w:type="spellStart"/>
+      <w:r>
+        <w:t>missForest</w:t>
+      </w:r>
+      <w:proofErr w:type="spellEnd"/>
+      <w:r>
+        <w:t xml:space="preserve">, which </w:t>
+      </w:r>
+      <w:proofErr w:type="gramStart"/>
+      <w:r>
+        <w:t>is able to</w:t>
+      </w:r>
+      <w:proofErr w:type="gramEnd"/>
+      <w:r>
+        <w:t xml:space="preserve"> iteratively </w:t>
+      </w:r>
+      <w:proofErr w:type="gramStart"/>
+      <w:r>
+        <w:t>predicting</w:t>
+      </w:r>
+      <w:proofErr w:type="gramEnd"/>
+      <w:r>
+        <w:t xml:space="preserve"> missing values using random forest models. </w:t>
+      </w:r>
+      <w:proofErr w:type="spellStart"/>
+      <w:r>
+        <w:t>MissForest</w:t>
+      </w:r>
+      <w:proofErr w:type="spellEnd"/>
+      <w:r>
+        <w:t xml:space="preserve"> works well in our case due to working with various kinds of continuous and categorical variables, creating a single </w:t>
+      </w:r>
+      <w:proofErr w:type="gramStart"/>
+      <w:r>
+        <w:t>completed</w:t>
+      </w:r>
+      <w:proofErr w:type="gramEnd"/>
+      <w:r>
+        <w:t xml:space="preserve"> data set by iteratively predicting missing values.</w:t>
+      </w:r>
+    </w:p>
+    <w:p/>
+    <w:p>
+      <w:r>
+        <w:t>In the histogram below, our target variable PH is considerably normal. In addition, we can see that there are many ranges of distributions in our histogram of the numeric predictors as some were normal, some were bi-modal and some were skewed. Because of so, we should consider standardization and normalization of predictors in our model building process.</w:t>
+      </w:r>
+    </w:p>
+    <w:p/>
+    <w:p>
+      <w:r>
+        <w:t xml:space="preserve">It is notable that </w:t>
+      </w:r>
+      <w:proofErr w:type="spellStart"/>
+      <w:r>
+        <w:t>Fill</w:t>
+      </w:r>
+      <w:proofErr w:type="gramStart"/>
+      <w:r>
+        <w:t>.Ounces</w:t>
+      </w:r>
+      <w:proofErr w:type="spellEnd"/>
+      <w:proofErr w:type="gramEnd"/>
+      <w:r>
+        <w:t xml:space="preserve">, </w:t>
+      </w:r>
+      <w:proofErr w:type="spellStart"/>
+      <w:proofErr w:type="gramStart"/>
+      <w:r>
+        <w:t>PC.Volume</w:t>
+      </w:r>
+      <w:proofErr w:type="spellEnd"/>
+      <w:proofErr w:type="gramEnd"/>
+      <w:r>
+        <w:t xml:space="preserve">, PSC, Carb.Pressure1, </w:t>
+      </w:r>
+      <w:proofErr w:type="spellStart"/>
+      <w:r>
+        <w:t>Fill.Pressure</w:t>
+      </w:r>
+      <w:proofErr w:type="spellEnd"/>
+      <w:r>
+        <w:t xml:space="preserve">, Temperature, MFR, </w:t>
+      </w:r>
+      <w:proofErr w:type="spellStart"/>
+      <w:r>
+        <w:t>Oxygen.Filler</w:t>
+      </w:r>
+      <w:proofErr w:type="spellEnd"/>
+      <w:r>
+        <w:t xml:space="preserve">, </w:t>
+      </w:r>
+      <w:proofErr w:type="spellStart"/>
+      <w:r>
+        <w:t>Air.Pressurer</w:t>
+      </w:r>
+      <w:proofErr w:type="spellEnd"/>
+      <w:r>
+        <w:t xml:space="preserve">, </w:t>
+      </w:r>
+      <w:proofErr w:type="spellStart"/>
+      <w:r>
+        <w:t>Filler.Speed</w:t>
+      </w:r>
+      <w:proofErr w:type="spellEnd"/>
+      <w:r>
+        <w:t xml:space="preserve"> </w:t>
+      </w:r>
+      <w:proofErr w:type="gramStart"/>
+      <w:r>
+        <w:t>contain</w:t>
+      </w:r>
+      <w:proofErr w:type="gramEnd"/>
+      <w:r>
+        <w:t xml:space="preserve"> </w:t>
+      </w:r>
+      <w:proofErr w:type="gramStart"/>
+      <w:r>
+        <w:t>a large number of</w:t>
+      </w:r>
+      <w:proofErr w:type="gramEnd"/>
+      <w:r>
+        <w:t xml:space="preserve"> outliers mostly skewed, so we will check if these variables have real impact on the target variable PH.</w:t>
+      </w:r>
+    </w:p>
+    <w:p/>
+    <w:p>
+      <w:r>
+        <w:t xml:space="preserve">Upon closer inspection, the predictor variables from the scatter plot below </w:t>
+      </w:r>
+      <w:proofErr w:type="gramStart"/>
+      <w:r>
+        <w:t>reveals</w:t>
+      </w:r>
+      <w:proofErr w:type="gramEnd"/>
+      <w:r>
+        <w:t xml:space="preserve"> many things in relation to the PH, but first, let's </w:t>
+      </w:r>
+      <w:proofErr w:type="gramStart"/>
+      <w:r>
+        <w:t>take a look</w:t>
+      </w:r>
+      <w:proofErr w:type="gramEnd"/>
+      <w:r>
+        <w:t xml:space="preserve"> at the predictors Temperature, </w:t>
+      </w:r>
+      <w:proofErr w:type="spellStart"/>
+      <w:r>
+        <w:t>Air.Pressurer</w:t>
+      </w:r>
+      <w:proofErr w:type="spellEnd"/>
+      <w:r>
+        <w:t xml:space="preserve"> and </w:t>
+      </w:r>
+      <w:proofErr w:type="spellStart"/>
+      <w:r>
+        <w:t>Filler.Speed</w:t>
+      </w:r>
+      <w:proofErr w:type="spellEnd"/>
+      <w:r>
+        <w:t>.</w:t>
+      </w:r>
+    </w:p>
+    <w:p/>
+    <w:p>
+      <w:r>
+        <w:t xml:space="preserve">In the individual scatter plot of Temperature, </w:t>
+      </w:r>
+      <w:proofErr w:type="spellStart"/>
+      <w:r>
+        <w:t>Air.Pressurer</w:t>
+      </w:r>
+      <w:proofErr w:type="spellEnd"/>
+      <w:r>
+        <w:t xml:space="preserve"> and </w:t>
+      </w:r>
+      <w:proofErr w:type="spellStart"/>
+      <w:r>
+        <w:t>Filler.Speed</w:t>
+      </w:r>
+      <w:proofErr w:type="spellEnd"/>
+      <w:r>
+        <w:t xml:space="preserve">, they show that they act more like a factor/category than numeric. For these predictors, it could possibly be controlled by a discrete machine or factory setting. For </w:t>
+      </w:r>
+      <w:proofErr w:type="spellStart"/>
+      <w:r>
+        <w:t>Filler.Speed</w:t>
+      </w:r>
+      <w:proofErr w:type="spellEnd"/>
+      <w:r>
+        <w:t>, the outliers scattered can be presumed to be from the machine alternating between 1000 and 4000. Since these predictors form vertical bands, it is suggested that they don't have high correlation to the PH. However, we can create a correlation table between these predictors and our target variable to verify.</w:t>
+      </w:r>
+    </w:p>
+    <w:p/>
+    <w:p>
+      <w:r>
+        <w:t xml:space="preserve">By creating a correlation table, we can see that </w:t>
+      </w:r>
+      <w:proofErr w:type="spellStart"/>
+      <w:r>
+        <w:t>Air.Pressure</w:t>
+      </w:r>
+      <w:proofErr w:type="spellEnd"/>
+      <w:r>
+        <w:t xml:space="preserve"> and </w:t>
+      </w:r>
+      <w:proofErr w:type="spellStart"/>
+      <w:r>
+        <w:t>Filler.Speed</w:t>
+      </w:r>
+      <w:proofErr w:type="spellEnd"/>
+      <w:r>
+        <w:t xml:space="preserve"> contain p values &gt; 0.05, signifying no meaningful linear relationship with PH. Temperature has a weak negative correlation to PH with (r = -0.158). While the correlation table shows no meaningful linear relationship, it is not recommended to remove these predictors based on p-values alone, as it disregards non-linear patterns. Additionally, predictors can have meaningful interactions with other predictors to predict PH well. This correlation table is just to test the linear relationships the predictors have on PH and to inform the outlier detection process.</w:t>
+      </w:r>
+    </w:p>
+    <w:p/>
+    <w:p>
+      <w:r>
+        <w:t xml:space="preserve">Afterwards, we can begin to do more analysis of the predictors left: Temperature, </w:t>
+      </w:r>
+      <w:proofErr w:type="spellStart"/>
+      <w:r>
+        <w:t>Fill.Ounces</w:t>
+      </w:r>
+      <w:proofErr w:type="spellEnd"/>
+      <w:r>
+        <w:t xml:space="preserve">, </w:t>
+      </w:r>
+      <w:proofErr w:type="spellStart"/>
+      <w:proofErr w:type="gramStart"/>
+      <w:r>
+        <w:t>PC.Volume</w:t>
+      </w:r>
+      <w:proofErr w:type="spellEnd"/>
+      <w:proofErr w:type="gramEnd"/>
+      <w:r>
+        <w:t xml:space="preserve">, PSC, Carb.Pressure1, </w:t>
+      </w:r>
+      <w:proofErr w:type="spellStart"/>
+      <w:r>
+        <w:t>Oxygen.Filler</w:t>
+      </w:r>
+      <w:proofErr w:type="spellEnd"/>
+      <w:r>
+        <w:t xml:space="preserve">, MFR and </w:t>
+      </w:r>
+      <w:proofErr w:type="spellStart"/>
+      <w:r>
+        <w:t>Fill.Pressure</w:t>
+      </w:r>
+      <w:proofErr w:type="spellEnd"/>
+      <w:r>
+        <w:t xml:space="preserve">. We will use the [IQR </w:t>
+      </w:r>
+      <w:proofErr w:type="gramStart"/>
+      <w:r>
+        <w:t>rule](</w:t>
+      </w:r>
+      <w:proofErr w:type="gramEnd"/>
+      <w:r>
+        <w:t>https://www.r-bloggers.com/2025/12/outliers-in-data-analysis-detecting-extreme-values-before-modeling-in-r-with-istanbul-airbnb-data/) for detecting outliers outside the IQR range (Q1 - 1.5 * IQR AND Q3 + 1.5 * IQR).</w:t>
+      </w:r>
+    </w:p>
+    <w:p/>
+    <w:p>
+      <w:r>
+        <w:t xml:space="preserve">The above scatterplot has overplotting issues due to the </w:t>
+      </w:r>
+      <w:proofErr w:type="gramStart"/>
+      <w:r>
+        <w:t>data points</w:t>
+      </w:r>
+      <w:proofErr w:type="gramEnd"/>
+      <w:r>
+        <w:t xml:space="preserve"> clustering in a cloud-like formation, so we decided on randomly sampling 500 rows of the dataset to reduce this issue. From the randomly sampled scatter plot of the predictors, we can see </w:t>
+      </w:r>
+      <w:proofErr w:type="gramStart"/>
+      <w:r>
+        <w:t>that:*</w:t>
+      </w:r>
+      <w:proofErr w:type="gramEnd"/>
+      <w:r>
+        <w:t>*</w:t>
+      </w:r>
+    </w:p>
+    <w:p>
+      <w:r>
+        <w:t>- `MFR` and `</w:t>
+      </w:r>
+      <w:proofErr w:type="spellStart"/>
+      <w:r>
+        <w:t>Fill.Pressure</w:t>
+      </w:r>
+      <w:proofErr w:type="spellEnd"/>
+      <w:r>
+        <w:t>` exhibits factor/category likeness, rather than numeric likeness. Distribution across the PH regression line suggestions no to weak correlation.</w:t>
+      </w:r>
+    </w:p>
+    <w:p>
+      <w:r>
+        <w:t>- `</w:t>
+      </w:r>
+      <w:proofErr w:type="spellStart"/>
+      <w:r>
+        <w:t>Fill.Ounces</w:t>
+      </w:r>
+      <w:proofErr w:type="spellEnd"/>
+      <w:r>
+        <w:t>`, `</w:t>
+      </w:r>
+      <w:proofErr w:type="spellStart"/>
+      <w:r>
+        <w:t>PC.Volume</w:t>
+      </w:r>
+      <w:proofErr w:type="spellEnd"/>
+      <w:r>
+        <w:t>`, `PSC`, `Carb.Pressure1` and `</w:t>
+      </w:r>
+      <w:proofErr w:type="spellStart"/>
+      <w:r>
+        <w:t>Oxygen.Filler</w:t>
+      </w:r>
+      <w:proofErr w:type="spellEnd"/>
+      <w:r>
+        <w:t>` points on the scatterplot exhibit weak/no relationship to the regression line of PH.</w:t>
+      </w:r>
+    </w:p>
+    <w:p/>
+    <w:p>
+      <w:r>
+        <w:t xml:space="preserve">We can additionally check MFR and </w:t>
+      </w:r>
+      <w:proofErr w:type="spellStart"/>
+      <w:r>
+        <w:t>Fill.Pressure</w:t>
+      </w:r>
+      <w:proofErr w:type="spellEnd"/>
+      <w:r>
+        <w:t xml:space="preserve"> for their correlation to PH as they exhibit vertical clustering. From the table, we can see that MFR has a </w:t>
+      </w:r>
+      <w:proofErr w:type="gramStart"/>
+      <w:r>
+        <w:t>p values</w:t>
+      </w:r>
+      <w:proofErr w:type="gramEnd"/>
+      <w:r>
+        <w:t xml:space="preserve"> &gt; 0.05, signifying no </w:t>
+      </w:r>
+      <w:r>
+        <w:lastRenderedPageBreak/>
+        <w:t xml:space="preserve">meaningful linear relationship with PH. While </w:t>
+      </w:r>
+      <w:proofErr w:type="spellStart"/>
+      <w:r>
+        <w:t>Fill.Pressure's</w:t>
+      </w:r>
+      <w:proofErr w:type="spellEnd"/>
+      <w:r>
+        <w:t xml:space="preserve"> p-value is &lt; 0.05 and signifies linear correlation to PH.</w:t>
+      </w:r>
+    </w:p>
+    <w:p/>
+    <w:p>
+      <w:r>
+        <w:t xml:space="preserve">From analyzing the predictors with seemingly large number of outliers or extreme outliers, it should be noted that none of the tested predictors have a notable significance to PH. Additionally, predictors such as MFR, </w:t>
+      </w:r>
+      <w:proofErr w:type="spellStart"/>
+      <w:r>
+        <w:t>Fill.Pressure</w:t>
+      </w:r>
+      <w:proofErr w:type="spellEnd"/>
+      <w:r>
+        <w:t xml:space="preserve">, Temperature, </w:t>
+      </w:r>
+      <w:proofErr w:type="spellStart"/>
+      <w:r>
+        <w:t>Air.Pressure</w:t>
+      </w:r>
+      <w:proofErr w:type="spellEnd"/>
+      <w:r>
+        <w:t xml:space="preserve"> and </w:t>
+      </w:r>
+      <w:proofErr w:type="spellStart"/>
+      <w:r>
+        <w:t>Filler.Speed</w:t>
+      </w:r>
+      <w:proofErr w:type="spellEnd"/>
+      <w:r>
+        <w:t xml:space="preserve"> exhibits factor/category likeness, rather than numeric likeness and their range outliers most likely stem from the machine or factory setting.</w:t>
+      </w:r>
+    </w:p>
+    <w:p/>
+    <w:p>
+      <w:r>
+        <w:t xml:space="preserve">Afterwards, we can check if the categorical variable </w:t>
+      </w:r>
+      <w:proofErr w:type="spellStart"/>
+      <w:r>
+        <w:t>Brand.Code</w:t>
+      </w:r>
+      <w:proofErr w:type="spellEnd"/>
+      <w:r>
+        <w:t xml:space="preserve"> has any significant predictive effects on the target variable PH. This is to inform us whether we should keep our categorical variable or not. Through the boxplot, we can see that each brand (including NAs) </w:t>
+      </w:r>
+      <w:proofErr w:type="gramStart"/>
+      <w:r>
+        <w:t>have</w:t>
+      </w:r>
+      <w:proofErr w:type="gramEnd"/>
+      <w:r>
+        <w:t xml:space="preserve"> varying median lines, indicating that they are different types of beverages that potentially come from various manufacturing processes. Interestingly, the NAs </w:t>
+      </w:r>
+      <w:proofErr w:type="spellStart"/>
+      <w:r>
+        <w:t>Brand.Code</w:t>
+      </w:r>
+      <w:proofErr w:type="spellEnd"/>
+      <w:r>
+        <w:t xml:space="preserve"> distribution ties closely to the distribution of all over </w:t>
+      </w:r>
+      <w:proofErr w:type="spellStart"/>
+      <w:proofErr w:type="gramStart"/>
+      <w:r>
+        <w:t>brand.codes</w:t>
+      </w:r>
+      <w:proofErr w:type="spellEnd"/>
+      <w:proofErr w:type="gramEnd"/>
+      <w:r>
+        <w:t>.</w:t>
+      </w:r>
+    </w:p>
+    <w:p/>
+    <w:p>
+      <w:r>
+        <w:t>Let's confirm that each brand has a statistically different PH distribution from every other brand through a [</w:t>
+      </w:r>
+      <w:proofErr w:type="spellStart"/>
+      <w:r>
+        <w:t>mann</w:t>
+      </w:r>
+      <w:proofErr w:type="spellEnd"/>
+      <w:r>
+        <w:t xml:space="preserve">-Whitney U </w:t>
+      </w:r>
+      <w:proofErr w:type="gramStart"/>
+      <w:r>
+        <w:t>test](</w:t>
+      </w:r>
+      <w:proofErr w:type="gramEnd"/>
+      <w:r>
+        <w:t xml:space="preserve">https://www.statology.org/mann-whitney-u-test/). As shown below, we can see that each pairwise comparison of </w:t>
+      </w:r>
+      <w:proofErr w:type="spellStart"/>
+      <w:r>
+        <w:t>Brand.Code</w:t>
+      </w:r>
+      <w:proofErr w:type="spellEnd"/>
+      <w:r>
+        <w:t xml:space="preserve"> has a statistically significant pH value (all p-values &lt; 0.05 after [Bonferroni </w:t>
+      </w:r>
+      <w:proofErr w:type="gramStart"/>
+      <w:r>
+        <w:t>correction](</w:t>
+      </w:r>
+      <w:proofErr w:type="gramEnd"/>
+      <w:r>
+        <w:t xml:space="preserve">https://www.statology.org/bonferroni-correction/)), </w:t>
+      </w:r>
+      <w:proofErr w:type="spellStart"/>
+      <w:r>
+        <w:t>indicting</w:t>
+      </w:r>
+      <w:proofErr w:type="spellEnd"/>
+      <w:r>
+        <w:t xml:space="preserve"> that the brands represent different beverage types or formulations, not only a minor change/variation.</w:t>
+      </w:r>
+    </w:p>
+    <w:p/>
+    <w:p>
+      <w:r>
+        <w:t xml:space="preserve">From an ANOVA test of the </w:t>
+      </w:r>
+      <w:proofErr w:type="spellStart"/>
+      <w:r>
+        <w:t>Brand.Code</w:t>
+      </w:r>
+      <w:proofErr w:type="spellEnd"/>
+      <w:r>
+        <w:t xml:space="preserve"> to see the effects of </w:t>
+      </w:r>
+      <w:proofErr w:type="spellStart"/>
+      <w:r>
+        <w:t>Brand.Code</w:t>
+      </w:r>
+      <w:proofErr w:type="spellEnd"/>
+      <w:r>
+        <w:t xml:space="preserve"> on PH, we can see that p &lt; 2e-16, signifying it as highly significant. Additionally, </w:t>
+      </w:r>
+      <w:proofErr w:type="spellStart"/>
+      <w:r>
+        <w:t>Brand.Code</w:t>
+      </w:r>
+      <w:proofErr w:type="spellEnd"/>
+      <w:r>
+        <w:t xml:space="preserve"> explains 11.7% of the variance in PH. Because of this, we decided to keep </w:t>
+      </w:r>
+      <w:proofErr w:type="spellStart"/>
+      <w:r>
+        <w:t>Brand.Code</w:t>
+      </w:r>
+      <w:proofErr w:type="spellEnd"/>
+      <w:r>
+        <w:t>.</w:t>
+      </w:r>
+    </w:p>
+    <w:p/>
+    <w:p>
+      <w:r>
+        <w:t xml:space="preserve">Before we begin to check the correlation of predictors, it is important to exclude PH from the training data so that it doesn't affect any of the predictor correlations. After doing so, we can start analyzing the relationships of the variables. Through the correlation plot below, we can see that variables such as </w:t>
+      </w:r>
+      <w:proofErr w:type="gramStart"/>
+      <w:r>
+        <w:t>Hy.Pressure</w:t>
+      </w:r>
+      <w:proofErr w:type="gramEnd"/>
+      <w:r>
+        <w:t xml:space="preserve">3, </w:t>
+      </w:r>
+      <w:proofErr w:type="spellStart"/>
+      <w:r>
+        <w:t>Filler.Level</w:t>
+      </w:r>
+      <w:proofErr w:type="spellEnd"/>
+      <w:r>
+        <w:t xml:space="preserve">, </w:t>
+      </w:r>
+      <w:proofErr w:type="spellStart"/>
+      <w:r>
+        <w:t>Filler.Speed</w:t>
+      </w:r>
+      <w:proofErr w:type="spellEnd"/>
+      <w:r>
+        <w:t xml:space="preserve">, Density, Balling, </w:t>
+      </w:r>
+      <w:proofErr w:type="spellStart"/>
+      <w:r>
+        <w:t>Alch.Rel</w:t>
+      </w:r>
+      <w:proofErr w:type="spellEnd"/>
+      <w:r>
+        <w:t xml:space="preserve"> and </w:t>
+      </w:r>
+      <w:proofErr w:type="spellStart"/>
+      <w:r>
+        <w:t>Carb.Rel</w:t>
+      </w:r>
+      <w:proofErr w:type="spellEnd"/>
+      <w:r>
+        <w:t xml:space="preserve"> have correlations &gt; 85%. Before we remove the variables, however, we can use the function </w:t>
+      </w:r>
+      <w:proofErr w:type="spellStart"/>
+      <w:proofErr w:type="gramStart"/>
+      <w:r>
+        <w:t>findCorrelation</w:t>
+      </w:r>
+      <w:proofErr w:type="spellEnd"/>
+      <w:r>
+        <w:t>(</w:t>
+      </w:r>
+      <w:proofErr w:type="gramEnd"/>
+      <w:r>
+        <w:t>) to match our correlation plot.</w:t>
+      </w:r>
+    </w:p>
+    <w:p>
+      <w:r>
+        <w:lastRenderedPageBreak/>
+        <w:t xml:space="preserve">From the </w:t>
+      </w:r>
+      <w:proofErr w:type="spellStart"/>
+      <w:r>
+        <w:t>findCorrelation</w:t>
+      </w:r>
+      <w:proofErr w:type="spellEnd"/>
+      <w:r>
+        <w:t xml:space="preserve"> function, we can see that they match the analysis of the correlation plot, </w:t>
+      </w:r>
+      <w:proofErr w:type="gramStart"/>
+      <w:r>
+        <w:t>with the exception of</w:t>
+      </w:r>
+      <w:proofErr w:type="gramEnd"/>
+      <w:r>
+        <w:t xml:space="preserve"> </w:t>
+      </w:r>
+      <w:proofErr w:type="spellStart"/>
+      <w:r>
+        <w:t>Carb.Rel</w:t>
+      </w:r>
+      <w:proofErr w:type="spellEnd"/>
+      <w:r>
+        <w:t xml:space="preserve">. This is likely due to </w:t>
+      </w:r>
+      <w:proofErr w:type="spellStart"/>
+      <w:r>
+        <w:t>carb.rel</w:t>
+      </w:r>
+      <w:proofErr w:type="spellEnd"/>
+      <w:r>
+        <w:t xml:space="preserve"> having an average correlation that is less than 85% with the other predictors. As such, it will not be a candidate for removal. However, the rest of the predictors: "Balling", "Hyd.Pressure3", "</w:t>
+      </w:r>
+      <w:proofErr w:type="spellStart"/>
+      <w:r>
+        <w:t>Alch.Rel</w:t>
+      </w:r>
+      <w:proofErr w:type="spellEnd"/>
+      <w:r>
+        <w:t>", "</w:t>
+      </w:r>
+      <w:proofErr w:type="spellStart"/>
+      <w:r>
+        <w:t>Balling.Lvl</w:t>
+      </w:r>
+      <w:proofErr w:type="spellEnd"/>
+      <w:r>
+        <w:t>", "Density", "</w:t>
+      </w:r>
+      <w:proofErr w:type="spellStart"/>
+      <w:r>
+        <w:t>Filler.Level</w:t>
+      </w:r>
+      <w:proofErr w:type="spellEnd"/>
+      <w:r>
+        <w:t>" and "</w:t>
+      </w:r>
+      <w:proofErr w:type="spellStart"/>
+      <w:r>
+        <w:t>Filler.Speed</w:t>
+      </w:r>
+      <w:proofErr w:type="spellEnd"/>
+      <w:r>
+        <w:t xml:space="preserve">" </w:t>
+      </w:r>
+      <w:proofErr w:type="gramStart"/>
+      <w:r>
+        <w:t>is</w:t>
+      </w:r>
+      <w:proofErr w:type="gramEnd"/>
+      <w:r>
+        <w:t xml:space="preserve"> recommended.</w:t>
+      </w:r>
+    </w:p>
     <w:sectPr>
       <w:pgSz w:w="12240" w:h="15840"/>
       <w:pgMar w:top="1440" w:right="1440" w:bottom="1440" w:left="1440" w:header="720" w:footer="720" w:gutter="0"/>

</xml_diff>